<commit_message>
docs: atualiza apostila de PostgreSQL para Linux
</commit_message>
<xml_diff>
--- a/docx/PostgreSQL_Linux/PostgreSQL_Linux.docx
+++ b/docx/PostgreSQL_Linux/PostgreSQL_Linux.docx
@@ -224,7 +224,7 @@
         <w:pStyle w:val="Heading1"/>
         <w:rPr/>
       </w:pPr>
-      <w:bookmarkStart w:colFirst="0" w:colLast="0" w:name="_vvu3vexdbhg" w:id="2"/>
+      <w:bookmarkStart w:colFirst="0" w:colLast="0" w:name="_i9c4muho0wxc" w:id="2"/>
       <w:bookmarkEnd w:id="2"/>
       <w:r>
         <w:br w:type="page"/>
@@ -235,17 +235,950 @@
         </w:rPr>
       </w:r>
     </w:p>
+    <w:sdt>
+      <w:sdtPr>
+        <w:id w:val="-842155873"/>
+        <w:docPartObj>
+          <w:docPartGallery w:val="Table of Contents"/>
+          <w:docPartUnique w:val="1"/>
+        </w:docPartObj>
+      </w:sdtPr>
+      <w:sdtContent>
+        <w:p>
+          <w:pPr>
+            <w:widowControl w:val="0"/>
+            <w:tabs>
+              <w:tab w:val="right" w:leader="dot" w:pos="12000"/>
+            </w:tabs>
+            <w:spacing w:before="60" w:line="240" w:lineRule="auto"/>
+            <w:rPr>
+              <w:b w:val="1"/>
+              <w:bCs w:val="1"/>
+              <w:color w:val="000000"/>
+              <w:u w:val="none"/>
+            </w:rPr>
+          </w:pPr>
+          <w:r>
+            <w:fldChar w:fldCharType="begin"/>
+            <w:instrText xml:space="preserve"> TOC \h \u \z \t "Heading 1,1,Heading 2,2,Heading 3,3,Heading 4,4,Heading 5,5,Heading 6,6,"</w:instrText>
+            <w:fldChar w:fldCharType="separate"/>
+          </w:r>
+          <w:hyperlink w:anchor="_lswrd8r1f676">
+            <w:r>
+              <w:rPr>
+                <w:rFonts w:ascii="Arial" w:cs="Arial" w:eastAsia="Arial" w:hAnsi="Arial"/>
+                <w:b w:val="1"/>
+                <w:bCs w:val="1"/>
+                <w:i w:val="0"/>
+                <w:iCs w:val="0"/>
+                <w:smallCaps w:val="0"/>
+                <w:strike w:val="0"/>
+                <w:color w:val="000000"/>
+                <w:sz w:val="28"/>
+                <w:szCs w:val="28"/>
+                <w:u w:val="none"/>
+                <w:shd w:fill="auto" w:val="clear"/>
+                <w:vertAlign w:val="baseline"/>
+                <w:rtl w:val="0"/>
+              </w:rPr>
+              <w:t xml:space="preserve">Instalação</w:t>
+              <w:tab/>
+              <w:t xml:space="preserve">3</w:t>
+            </w:r>
+          </w:hyperlink>
+          <w:r>
+            <w:rPr>
+              <w:rtl w:val="0"/>
+            </w:rPr>
+          </w:r>
+        </w:p>
+        <w:p>
+          <w:pPr>
+            <w:widowControl w:val="0"/>
+            <w:tabs>
+              <w:tab w:val="right" w:leader="dot" w:pos="12000"/>
+            </w:tabs>
+            <w:spacing w:before="60" w:line="240" w:lineRule="auto"/>
+            <w:ind w:left="360" w:firstLine="0"/>
+            <w:rPr>
+              <w:color w:val="000000"/>
+              <w:u w:val="none"/>
+            </w:rPr>
+          </w:pPr>
+          <w:hyperlink w:anchor="_ogkg0i61d2vr">
+            <w:r>
+              <w:rPr>
+                <w:rFonts w:ascii="Arial" w:cs="Arial" w:eastAsia="Arial" w:hAnsi="Arial"/>
+                <w:b w:val="0"/>
+                <w:bCs w:val="0"/>
+                <w:i w:val="0"/>
+                <w:iCs w:val="0"/>
+                <w:smallCaps w:val="0"/>
+                <w:strike w:val="0"/>
+                <w:color w:val="000000"/>
+                <w:sz w:val="28"/>
+                <w:szCs w:val="28"/>
+                <w:u w:val="none"/>
+                <w:shd w:fill="auto" w:val="clear"/>
+                <w:vertAlign w:val="baseline"/>
+                <w:rtl w:val="0"/>
+              </w:rPr>
+              <w:t xml:space="preserve">Atualizar lista de pacotes</w:t>
+              <w:tab/>
+              <w:t xml:space="preserve">3</w:t>
+            </w:r>
+          </w:hyperlink>
+          <w:r>
+            <w:rPr>
+              <w:rtl w:val="0"/>
+            </w:rPr>
+          </w:r>
+        </w:p>
+        <w:p>
+          <w:pPr>
+            <w:widowControl w:val="0"/>
+            <w:tabs>
+              <w:tab w:val="right" w:leader="dot" w:pos="12000"/>
+            </w:tabs>
+            <w:spacing w:before="60" w:line="240" w:lineRule="auto"/>
+            <w:ind w:left="360" w:firstLine="0"/>
+            <w:rPr>
+              <w:color w:val="000000"/>
+              <w:u w:val="none"/>
+            </w:rPr>
+          </w:pPr>
+          <w:hyperlink w:anchor="_i4ymig78zhck">
+            <w:r>
+              <w:rPr>
+                <w:rFonts w:ascii="Arial" w:cs="Arial" w:eastAsia="Arial" w:hAnsi="Arial"/>
+                <w:b w:val="0"/>
+                <w:bCs w:val="0"/>
+                <w:i w:val="0"/>
+                <w:iCs w:val="0"/>
+                <w:smallCaps w:val="0"/>
+                <w:strike w:val="0"/>
+                <w:color w:val="000000"/>
+                <w:sz w:val="28"/>
+                <w:szCs w:val="28"/>
+                <w:u w:val="none"/>
+                <w:shd w:fill="auto" w:val="clear"/>
+                <w:vertAlign w:val="baseline"/>
+                <w:rtl w:val="0"/>
+              </w:rPr>
+              <w:t xml:space="preserve">Instalar postgres</w:t>
+              <w:tab/>
+              <w:t xml:space="preserve">3</w:t>
+            </w:r>
+          </w:hyperlink>
+          <w:r>
+            <w:rPr>
+              <w:rtl w:val="0"/>
+            </w:rPr>
+          </w:r>
+        </w:p>
+        <w:p>
+          <w:pPr>
+            <w:widowControl w:val="0"/>
+            <w:tabs>
+              <w:tab w:val="right" w:leader="dot" w:pos="12000"/>
+            </w:tabs>
+            <w:spacing w:before="60" w:line="240" w:lineRule="auto"/>
+            <w:ind w:left="360" w:firstLine="0"/>
+            <w:rPr>
+              <w:color w:val="000000"/>
+              <w:u w:val="none"/>
+            </w:rPr>
+          </w:pPr>
+          <w:hyperlink w:anchor="_pu2jo969e7v7">
+            <w:r>
+              <w:rPr>
+                <w:rFonts w:ascii="Arial" w:cs="Arial" w:eastAsia="Arial" w:hAnsi="Arial"/>
+                <w:b w:val="0"/>
+                <w:bCs w:val="0"/>
+                <w:i w:val="0"/>
+                <w:iCs w:val="0"/>
+                <w:smallCaps w:val="0"/>
+                <w:strike w:val="0"/>
+                <w:color w:val="000000"/>
+                <w:sz w:val="28"/>
+                <w:szCs w:val="28"/>
+                <w:u w:val="none"/>
+                <w:shd w:fill="auto" w:val="clear"/>
+                <w:vertAlign w:val="baseline"/>
+                <w:rtl w:val="0"/>
+              </w:rPr>
+              <w:t xml:space="preserve">Configurar Repositório Automático</w:t>
+              <w:tab/>
+              <w:t xml:space="preserve">3</w:t>
+            </w:r>
+          </w:hyperlink>
+          <w:r>
+            <w:rPr>
+              <w:rtl w:val="0"/>
+            </w:rPr>
+          </w:r>
+        </w:p>
+        <w:p>
+          <w:pPr>
+            <w:widowControl w:val="0"/>
+            <w:tabs>
+              <w:tab w:val="right" w:leader="dot" w:pos="12000"/>
+            </w:tabs>
+            <w:spacing w:before="60" w:line="240" w:lineRule="auto"/>
+            <w:ind w:left="360" w:firstLine="0"/>
+            <w:rPr>
+              <w:color w:val="000000"/>
+              <w:u w:val="none"/>
+            </w:rPr>
+          </w:pPr>
+          <w:hyperlink w:anchor="_feg8odw5wi2">
+            <w:r>
+              <w:rPr>
+                <w:rFonts w:ascii="Arial" w:cs="Arial" w:eastAsia="Arial" w:hAnsi="Arial"/>
+                <w:b w:val="0"/>
+                <w:bCs w:val="0"/>
+                <w:i w:val="0"/>
+                <w:iCs w:val="0"/>
+                <w:smallCaps w:val="0"/>
+                <w:strike w:val="0"/>
+                <w:color w:val="000000"/>
+                <w:sz w:val="28"/>
+                <w:szCs w:val="28"/>
+                <w:u w:val="none"/>
+                <w:shd w:fill="auto" w:val="clear"/>
+                <w:vertAlign w:val="baseline"/>
+                <w:rtl w:val="0"/>
+              </w:rPr>
+              <w:t xml:space="preserve">Verificar Instalação</w:t>
+              <w:tab/>
+              <w:t xml:space="preserve">3</w:t>
+            </w:r>
+          </w:hyperlink>
+          <w:r>
+            <w:rPr>
+              <w:rtl w:val="0"/>
+            </w:rPr>
+          </w:r>
+        </w:p>
+        <w:p>
+          <w:pPr>
+            <w:widowControl w:val="0"/>
+            <w:tabs>
+              <w:tab w:val="right" w:leader="dot" w:pos="12000"/>
+            </w:tabs>
+            <w:spacing w:before="60" w:line="240" w:lineRule="auto"/>
+            <w:ind w:left="360" w:firstLine="0"/>
+            <w:rPr>
+              <w:color w:val="000000"/>
+              <w:u w:val="none"/>
+            </w:rPr>
+          </w:pPr>
+          <w:hyperlink w:anchor="_tfs66oskrpgx">
+            <w:r>
+              <w:rPr>
+                <w:rFonts w:ascii="Arial" w:cs="Arial" w:eastAsia="Arial" w:hAnsi="Arial"/>
+                <w:b w:val="0"/>
+                <w:bCs w:val="0"/>
+                <w:i w:val="0"/>
+                <w:iCs w:val="0"/>
+                <w:smallCaps w:val="0"/>
+                <w:strike w:val="0"/>
+                <w:color w:val="000000"/>
+                <w:sz w:val="28"/>
+                <w:szCs w:val="28"/>
+                <w:u w:val="none"/>
+                <w:shd w:fill="auto" w:val="clear"/>
+                <w:vertAlign w:val="baseline"/>
+                <w:rtl w:val="0"/>
+              </w:rPr>
+              <w:t xml:space="preserve">Parar o PostgreSQL</w:t>
+              <w:tab/>
+              <w:t xml:space="preserve">3</w:t>
+            </w:r>
+          </w:hyperlink>
+          <w:r>
+            <w:rPr>
+              <w:rtl w:val="0"/>
+            </w:rPr>
+          </w:r>
+        </w:p>
+        <w:p>
+          <w:pPr>
+            <w:widowControl w:val="0"/>
+            <w:tabs>
+              <w:tab w:val="right" w:leader="dot" w:pos="12000"/>
+            </w:tabs>
+            <w:spacing w:before="60" w:line="240" w:lineRule="auto"/>
+            <w:ind w:left="360" w:firstLine="0"/>
+            <w:rPr>
+              <w:color w:val="000000"/>
+              <w:u w:val="none"/>
+            </w:rPr>
+          </w:pPr>
+          <w:hyperlink w:anchor="_4rb4ilw5cipe">
+            <w:r>
+              <w:rPr>
+                <w:rFonts w:ascii="Arial" w:cs="Arial" w:eastAsia="Arial" w:hAnsi="Arial"/>
+                <w:b w:val="0"/>
+                <w:bCs w:val="0"/>
+                <w:i w:val="0"/>
+                <w:iCs w:val="0"/>
+                <w:smallCaps w:val="0"/>
+                <w:strike w:val="0"/>
+                <w:color w:val="000000"/>
+                <w:sz w:val="28"/>
+                <w:szCs w:val="28"/>
+                <w:u w:val="none"/>
+                <w:shd w:fill="auto" w:val="clear"/>
+                <w:vertAlign w:val="baseline"/>
+                <w:rtl w:val="0"/>
+              </w:rPr>
+              <w:t xml:space="preserve">Ativar o PostgreSQL</w:t>
+              <w:tab/>
+              <w:t xml:space="preserve">3</w:t>
+            </w:r>
+          </w:hyperlink>
+          <w:r>
+            <w:rPr>
+              <w:rtl w:val="0"/>
+            </w:rPr>
+          </w:r>
+        </w:p>
+        <w:p>
+          <w:pPr>
+            <w:widowControl w:val="0"/>
+            <w:tabs>
+              <w:tab w:val="right" w:leader="dot" w:pos="12000"/>
+            </w:tabs>
+            <w:spacing w:before="60" w:line="240" w:lineRule="auto"/>
+            <w:rPr>
+              <w:b w:val="1"/>
+              <w:bCs w:val="1"/>
+              <w:color w:val="000000"/>
+              <w:u w:val="none"/>
+            </w:rPr>
+          </w:pPr>
+          <w:hyperlink w:anchor="_x0fwppfpj4fv">
+            <w:r>
+              <w:rPr>
+                <w:rFonts w:ascii="Arial" w:cs="Arial" w:eastAsia="Arial" w:hAnsi="Arial"/>
+                <w:b w:val="1"/>
+                <w:bCs w:val="1"/>
+                <w:i w:val="0"/>
+                <w:iCs w:val="0"/>
+                <w:smallCaps w:val="0"/>
+                <w:strike w:val="0"/>
+                <w:color w:val="000000"/>
+                <w:sz w:val="28"/>
+                <w:szCs w:val="28"/>
+                <w:u w:val="none"/>
+                <w:shd w:fill="auto" w:val="clear"/>
+                <w:vertAlign w:val="baseline"/>
+                <w:rtl w:val="0"/>
+              </w:rPr>
+              <w:t xml:space="preserve">Trabalhando Via CLI</w:t>
+              <w:tab/>
+              <w:t xml:space="preserve">4</w:t>
+            </w:r>
+          </w:hyperlink>
+          <w:r>
+            <w:rPr>
+              <w:rtl w:val="0"/>
+            </w:rPr>
+          </w:r>
+        </w:p>
+        <w:p>
+          <w:pPr>
+            <w:widowControl w:val="0"/>
+            <w:tabs>
+              <w:tab w:val="right" w:leader="dot" w:pos="12000"/>
+            </w:tabs>
+            <w:spacing w:before="60" w:line="240" w:lineRule="auto"/>
+            <w:ind w:left="360" w:firstLine="0"/>
+            <w:rPr>
+              <w:color w:val="000000"/>
+              <w:u w:val="none"/>
+            </w:rPr>
+          </w:pPr>
+          <w:hyperlink w:anchor="_l93um6h51vfo">
+            <w:r>
+              <w:rPr>
+                <w:rFonts w:ascii="Arial" w:cs="Arial" w:eastAsia="Arial" w:hAnsi="Arial"/>
+                <w:b w:val="0"/>
+                <w:bCs w:val="0"/>
+                <w:i w:val="0"/>
+                <w:iCs w:val="0"/>
+                <w:smallCaps w:val="0"/>
+                <w:strike w:val="0"/>
+                <w:color w:val="000000"/>
+                <w:sz w:val="28"/>
+                <w:szCs w:val="28"/>
+                <w:u w:val="none"/>
+                <w:shd w:fill="auto" w:val="clear"/>
+                <w:vertAlign w:val="baseline"/>
+                <w:rtl w:val="0"/>
+              </w:rPr>
+              <w:t xml:space="preserve">Autenticar no Postgres</w:t>
+              <w:tab/>
+              <w:t xml:space="preserve">4</w:t>
+            </w:r>
+          </w:hyperlink>
+          <w:r>
+            <w:rPr>
+              <w:rtl w:val="0"/>
+            </w:rPr>
+          </w:r>
+        </w:p>
+        <w:p>
+          <w:pPr>
+            <w:widowControl w:val="0"/>
+            <w:tabs>
+              <w:tab w:val="right" w:leader="dot" w:pos="12000"/>
+            </w:tabs>
+            <w:spacing w:before="60" w:line="240" w:lineRule="auto"/>
+            <w:ind w:left="720" w:firstLine="0"/>
+            <w:rPr>
+              <w:color w:val="000000"/>
+              <w:u w:val="none"/>
+            </w:rPr>
+          </w:pPr>
+          <w:hyperlink w:anchor="_tq31s8rtai0f">
+            <w:r>
+              <w:rPr>
+                <w:rFonts w:ascii="Arial" w:cs="Arial" w:eastAsia="Arial" w:hAnsi="Arial"/>
+                <w:b w:val="0"/>
+                <w:bCs w:val="0"/>
+                <w:i w:val="0"/>
+                <w:iCs w:val="0"/>
+                <w:smallCaps w:val="0"/>
+                <w:strike w:val="0"/>
+                <w:color w:val="000000"/>
+                <w:sz w:val="28"/>
+                <w:szCs w:val="28"/>
+                <w:u w:val="none"/>
+                <w:shd w:fill="auto" w:val="clear"/>
+                <w:vertAlign w:val="baseline"/>
+                <w:rtl w:val="0"/>
+              </w:rPr>
+              <w:t xml:space="preserve">Falha de autenticação do tipo ‘peer’</w:t>
+              <w:tab/>
+              <w:t xml:space="preserve">4</w:t>
+            </w:r>
+          </w:hyperlink>
+          <w:r>
+            <w:rPr>
+              <w:rtl w:val="0"/>
+            </w:rPr>
+          </w:r>
+        </w:p>
+        <w:p>
+          <w:pPr>
+            <w:widowControl w:val="0"/>
+            <w:tabs>
+              <w:tab w:val="right" w:leader="dot" w:pos="12000"/>
+            </w:tabs>
+            <w:spacing w:before="60" w:line="240" w:lineRule="auto"/>
+            <w:ind w:left="360" w:firstLine="0"/>
+            <w:rPr>
+              <w:color w:val="000000"/>
+              <w:u w:val="none"/>
+            </w:rPr>
+          </w:pPr>
+          <w:hyperlink w:anchor="_s2qfkvbq3r0x">
+            <w:r>
+              <w:rPr>
+                <w:rFonts w:ascii="Arial" w:cs="Arial" w:eastAsia="Arial" w:hAnsi="Arial"/>
+                <w:b w:val="0"/>
+                <w:bCs w:val="0"/>
+                <w:i w:val="0"/>
+                <w:iCs w:val="0"/>
+                <w:smallCaps w:val="0"/>
+                <w:strike w:val="0"/>
+                <w:color w:val="000000"/>
+                <w:sz w:val="28"/>
+                <w:szCs w:val="28"/>
+                <w:u w:val="none"/>
+                <w:shd w:fill="auto" w:val="clear"/>
+                <w:vertAlign w:val="baseline"/>
+                <w:rtl w:val="0"/>
+              </w:rPr>
+              <w:t xml:space="preserve">Trocar a Senha do Usuário</w:t>
+              <w:tab/>
+              <w:t xml:space="preserve">4</w:t>
+            </w:r>
+          </w:hyperlink>
+          <w:r>
+            <w:rPr>
+              <w:rtl w:val="0"/>
+            </w:rPr>
+          </w:r>
+        </w:p>
+        <w:p>
+          <w:pPr>
+            <w:widowControl w:val="0"/>
+            <w:tabs>
+              <w:tab w:val="right" w:leader="dot" w:pos="12000"/>
+            </w:tabs>
+            <w:spacing w:before="60" w:line="240" w:lineRule="auto"/>
+            <w:ind w:left="360" w:firstLine="0"/>
+            <w:rPr>
+              <w:color w:val="000000"/>
+              <w:u w:val="none"/>
+            </w:rPr>
+          </w:pPr>
+          <w:hyperlink w:anchor="_3ujamar0g71u">
+            <w:r>
+              <w:rPr>
+                <w:rFonts w:ascii="Arial" w:cs="Arial" w:eastAsia="Arial" w:hAnsi="Arial"/>
+                <w:b w:val="0"/>
+                <w:bCs w:val="0"/>
+                <w:i w:val="0"/>
+                <w:iCs w:val="0"/>
+                <w:smallCaps w:val="0"/>
+                <w:strike w:val="0"/>
+                <w:color w:val="000000"/>
+                <w:sz w:val="28"/>
+                <w:szCs w:val="28"/>
+                <w:u w:val="none"/>
+                <w:shd w:fill="auto" w:val="clear"/>
+                <w:vertAlign w:val="baseline"/>
+                <w:rtl w:val="0"/>
+              </w:rPr>
+              <w:t xml:space="preserve">Criar Banco de Dados</w:t>
+              <w:tab/>
+              <w:t xml:space="preserve">4</w:t>
+            </w:r>
+          </w:hyperlink>
+          <w:r>
+            <w:rPr>
+              <w:rtl w:val="0"/>
+            </w:rPr>
+          </w:r>
+        </w:p>
+        <w:p>
+          <w:pPr>
+            <w:widowControl w:val="0"/>
+            <w:tabs>
+              <w:tab w:val="right" w:leader="dot" w:pos="12000"/>
+            </w:tabs>
+            <w:spacing w:before="60" w:line="240" w:lineRule="auto"/>
+            <w:ind w:left="360" w:firstLine="0"/>
+            <w:rPr>
+              <w:color w:val="000000"/>
+              <w:u w:val="none"/>
+            </w:rPr>
+          </w:pPr>
+          <w:hyperlink w:anchor="_lhc9he6sblom">
+            <w:r>
+              <w:rPr>
+                <w:rFonts w:ascii="Arial" w:cs="Arial" w:eastAsia="Arial" w:hAnsi="Arial"/>
+                <w:b w:val="0"/>
+                <w:bCs w:val="0"/>
+                <w:i w:val="0"/>
+                <w:iCs w:val="0"/>
+                <w:smallCaps w:val="0"/>
+                <w:strike w:val="0"/>
+                <w:color w:val="000000"/>
+                <w:sz w:val="28"/>
+                <w:szCs w:val="28"/>
+                <w:u w:val="none"/>
+                <w:shd w:fill="auto" w:val="clear"/>
+                <w:vertAlign w:val="baseline"/>
+                <w:rtl w:val="0"/>
+              </w:rPr>
+              <w:t xml:space="preserve">Acessar Banco de Dados</w:t>
+              <w:tab/>
+              <w:t xml:space="preserve">5</w:t>
+            </w:r>
+          </w:hyperlink>
+          <w:r>
+            <w:rPr>
+              <w:rtl w:val="0"/>
+            </w:rPr>
+          </w:r>
+        </w:p>
+        <w:p>
+          <w:pPr>
+            <w:widowControl w:val="0"/>
+            <w:tabs>
+              <w:tab w:val="right" w:leader="dot" w:pos="12000"/>
+            </w:tabs>
+            <w:spacing w:before="60" w:line="240" w:lineRule="auto"/>
+            <w:ind w:left="360" w:firstLine="0"/>
+            <w:rPr>
+              <w:color w:val="000000"/>
+              <w:u w:val="none"/>
+            </w:rPr>
+          </w:pPr>
+          <w:hyperlink w:anchor="_tobhl41nhx6y">
+            <w:r>
+              <w:rPr>
+                <w:rFonts w:ascii="Arial" w:cs="Arial" w:eastAsia="Arial" w:hAnsi="Arial"/>
+                <w:b w:val="0"/>
+                <w:bCs w:val="0"/>
+                <w:i w:val="0"/>
+                <w:iCs w:val="0"/>
+                <w:smallCaps w:val="0"/>
+                <w:strike w:val="0"/>
+                <w:color w:val="000000"/>
+                <w:sz w:val="28"/>
+                <w:szCs w:val="28"/>
+                <w:u w:val="none"/>
+                <w:shd w:fill="auto" w:val="clear"/>
+                <w:vertAlign w:val="baseline"/>
+                <w:rtl w:val="0"/>
+              </w:rPr>
+              <w:t xml:space="preserve">Sair do Banco de Dados</w:t>
+              <w:tab/>
+              <w:t xml:space="preserve">5</w:t>
+            </w:r>
+          </w:hyperlink>
+          <w:r>
+            <w:rPr>
+              <w:rtl w:val="0"/>
+            </w:rPr>
+          </w:r>
+        </w:p>
+        <w:p>
+          <w:pPr>
+            <w:widowControl w:val="0"/>
+            <w:tabs>
+              <w:tab w:val="right" w:leader="dot" w:pos="12000"/>
+            </w:tabs>
+            <w:spacing w:before="60" w:line="240" w:lineRule="auto"/>
+            <w:ind w:left="360" w:firstLine="0"/>
+            <w:rPr>
+              <w:color w:val="000000"/>
+              <w:u w:val="none"/>
+            </w:rPr>
+          </w:pPr>
+          <w:hyperlink w:anchor="_hiao7qbh32d5">
+            <w:r>
+              <w:rPr>
+                <w:rFonts w:ascii="Arial" w:cs="Arial" w:eastAsia="Arial" w:hAnsi="Arial"/>
+                <w:b w:val="0"/>
+                <w:bCs w:val="0"/>
+                <w:i w:val="0"/>
+                <w:iCs w:val="0"/>
+                <w:smallCaps w:val="0"/>
+                <w:strike w:val="0"/>
+                <w:color w:val="000000"/>
+                <w:sz w:val="28"/>
+                <w:szCs w:val="28"/>
+                <w:u w:val="none"/>
+                <w:shd w:fill="auto" w:val="clear"/>
+                <w:vertAlign w:val="baseline"/>
+                <w:rtl w:val="0"/>
+              </w:rPr>
+              <w:t xml:space="preserve">Listar Bancos de Dados</w:t>
+              <w:tab/>
+              <w:t xml:space="preserve">5</w:t>
+            </w:r>
+          </w:hyperlink>
+          <w:r>
+            <w:rPr>
+              <w:rtl w:val="0"/>
+            </w:rPr>
+          </w:r>
+        </w:p>
+        <w:p>
+          <w:pPr>
+            <w:widowControl w:val="0"/>
+            <w:tabs>
+              <w:tab w:val="right" w:leader="dot" w:pos="12000"/>
+            </w:tabs>
+            <w:spacing w:before="60" w:line="240" w:lineRule="auto"/>
+            <w:ind w:left="360" w:firstLine="0"/>
+            <w:rPr>
+              <w:color w:val="000000"/>
+              <w:u w:val="none"/>
+            </w:rPr>
+          </w:pPr>
+          <w:hyperlink w:anchor="_2qedi93oac2m">
+            <w:r>
+              <w:rPr>
+                <w:rFonts w:ascii="Arial" w:cs="Arial" w:eastAsia="Arial" w:hAnsi="Arial"/>
+                <w:b w:val="0"/>
+                <w:bCs w:val="0"/>
+                <w:i w:val="0"/>
+                <w:iCs w:val="0"/>
+                <w:smallCaps w:val="0"/>
+                <w:strike w:val="0"/>
+                <w:color w:val="000000"/>
+                <w:sz w:val="28"/>
+                <w:szCs w:val="28"/>
+                <w:u w:val="none"/>
+                <w:shd w:fill="auto" w:val="clear"/>
+                <w:vertAlign w:val="baseline"/>
+                <w:rtl w:val="0"/>
+              </w:rPr>
+              <w:t xml:space="preserve">Acessar um Banco de Dados</w:t>
+              <w:tab/>
+              <w:t xml:space="preserve">5</w:t>
+            </w:r>
+          </w:hyperlink>
+          <w:r>
+            <w:rPr>
+              <w:rtl w:val="0"/>
+            </w:rPr>
+          </w:r>
+        </w:p>
+        <w:p>
+          <w:pPr>
+            <w:widowControl w:val="0"/>
+            <w:tabs>
+              <w:tab w:val="right" w:leader="dot" w:pos="12000"/>
+            </w:tabs>
+            <w:spacing w:before="60" w:line="240" w:lineRule="auto"/>
+            <w:ind w:left="360" w:firstLine="0"/>
+            <w:rPr>
+              <w:color w:val="000000"/>
+              <w:u w:val="none"/>
+            </w:rPr>
+          </w:pPr>
+          <w:hyperlink w:anchor="_i26w3zadl3fm">
+            <w:r>
+              <w:rPr>
+                <w:rFonts w:ascii="Arial" w:cs="Arial" w:eastAsia="Arial" w:hAnsi="Arial"/>
+                <w:b w:val="0"/>
+                <w:bCs w:val="0"/>
+                <w:i w:val="0"/>
+                <w:iCs w:val="0"/>
+                <w:smallCaps w:val="0"/>
+                <w:strike w:val="0"/>
+                <w:color w:val="000000"/>
+                <w:sz w:val="28"/>
+                <w:szCs w:val="28"/>
+                <w:u w:val="none"/>
+                <w:shd w:fill="auto" w:val="clear"/>
+                <w:vertAlign w:val="baseline"/>
+                <w:rtl w:val="0"/>
+              </w:rPr>
+              <w:t xml:space="preserve">Listar Tabelas do BD</w:t>
+              <w:tab/>
+              <w:t xml:space="preserve">5</w:t>
+            </w:r>
+          </w:hyperlink>
+          <w:r>
+            <w:rPr>
+              <w:rtl w:val="0"/>
+            </w:rPr>
+          </w:r>
+        </w:p>
+        <w:p>
+          <w:pPr>
+            <w:widowControl w:val="0"/>
+            <w:tabs>
+              <w:tab w:val="right" w:leader="dot" w:pos="12000"/>
+            </w:tabs>
+            <w:spacing w:before="60" w:line="240" w:lineRule="auto"/>
+            <w:rPr>
+              <w:b w:val="1"/>
+              <w:bCs w:val="1"/>
+              <w:color w:val="000000"/>
+              <w:u w:val="none"/>
+            </w:rPr>
+          </w:pPr>
+          <w:hyperlink w:anchor="_4tn05rz177xf">
+            <w:r>
+              <w:rPr>
+                <w:rFonts w:ascii="Arial" w:cs="Arial" w:eastAsia="Arial" w:hAnsi="Arial"/>
+                <w:b w:val="1"/>
+                <w:bCs w:val="1"/>
+                <w:i w:val="0"/>
+                <w:iCs w:val="0"/>
+                <w:smallCaps w:val="0"/>
+                <w:strike w:val="0"/>
+                <w:color w:val="000000"/>
+                <w:sz w:val="28"/>
+                <w:szCs w:val="28"/>
+                <w:u w:val="none"/>
+                <w:shd w:fill="auto" w:val="clear"/>
+                <w:vertAlign w:val="baseline"/>
+                <w:rtl w:val="0"/>
+              </w:rPr>
+              <w:t xml:space="preserve">Instalar pgAdmin4</w:t>
+              <w:tab/>
+              <w:t xml:space="preserve">6</w:t>
+            </w:r>
+          </w:hyperlink>
+          <w:r>
+            <w:rPr>
+              <w:rtl w:val="0"/>
+            </w:rPr>
+          </w:r>
+        </w:p>
+        <w:p>
+          <w:pPr>
+            <w:widowControl w:val="0"/>
+            <w:tabs>
+              <w:tab w:val="right" w:leader="dot" w:pos="12000"/>
+            </w:tabs>
+            <w:spacing w:before="60" w:line="240" w:lineRule="auto"/>
+            <w:ind w:left="360" w:firstLine="0"/>
+            <w:rPr>
+              <w:color w:val="000000"/>
+              <w:u w:val="none"/>
+            </w:rPr>
+          </w:pPr>
+          <w:hyperlink w:anchor="_abbgg543k0dv">
+            <w:r>
+              <w:rPr>
+                <w:rFonts w:ascii="Arial" w:cs="Arial" w:eastAsia="Arial" w:hAnsi="Arial"/>
+                <w:b w:val="0"/>
+                <w:bCs w:val="0"/>
+                <w:i w:val="0"/>
+                <w:iCs w:val="0"/>
+                <w:smallCaps w:val="0"/>
+                <w:strike w:val="0"/>
+                <w:color w:val="000000"/>
+                <w:sz w:val="28"/>
+                <w:szCs w:val="28"/>
+                <w:u w:val="none"/>
+                <w:shd w:fill="auto" w:val="clear"/>
+                <w:vertAlign w:val="baseline"/>
+                <w:rtl w:val="0"/>
+              </w:rPr>
+              <w:t xml:space="preserve">Instalar Chave Pública</w:t>
+              <w:tab/>
+              <w:t xml:space="preserve">6</w:t>
+            </w:r>
+          </w:hyperlink>
+          <w:r>
+            <w:rPr>
+              <w:rtl w:val="0"/>
+            </w:rPr>
+          </w:r>
+        </w:p>
+        <w:p>
+          <w:pPr>
+            <w:widowControl w:val="0"/>
+            <w:tabs>
+              <w:tab w:val="right" w:leader="dot" w:pos="12000"/>
+            </w:tabs>
+            <w:spacing w:before="60" w:line="240" w:lineRule="auto"/>
+            <w:ind w:left="360" w:firstLine="0"/>
+            <w:rPr>
+              <w:color w:val="000000"/>
+              <w:u w:val="none"/>
+            </w:rPr>
+          </w:pPr>
+          <w:hyperlink w:anchor="_cygb6dp5gz0l">
+            <w:r>
+              <w:rPr>
+                <w:rFonts w:ascii="Arial" w:cs="Arial" w:eastAsia="Arial" w:hAnsi="Arial"/>
+                <w:b w:val="0"/>
+                <w:bCs w:val="0"/>
+                <w:i w:val="0"/>
+                <w:iCs w:val="0"/>
+                <w:smallCaps w:val="0"/>
+                <w:strike w:val="0"/>
+                <w:color w:val="000000"/>
+                <w:sz w:val="28"/>
+                <w:szCs w:val="28"/>
+                <w:u w:val="none"/>
+                <w:shd w:fill="auto" w:val="clear"/>
+                <w:vertAlign w:val="baseline"/>
+                <w:rtl w:val="0"/>
+              </w:rPr>
+              <w:t xml:space="preserve">Criar Repositório de Configuração</w:t>
+              <w:tab/>
+              <w:t xml:space="preserve">6</w:t>
+            </w:r>
+          </w:hyperlink>
+          <w:r>
+            <w:rPr>
+              <w:rtl w:val="0"/>
+            </w:rPr>
+          </w:r>
+        </w:p>
+        <w:p>
+          <w:pPr>
+            <w:widowControl w:val="0"/>
+            <w:tabs>
+              <w:tab w:val="right" w:leader="dot" w:pos="12000"/>
+            </w:tabs>
+            <w:spacing w:before="60" w:line="240" w:lineRule="auto"/>
+            <w:ind w:left="360" w:firstLine="0"/>
+            <w:rPr>
+              <w:color w:val="000000"/>
+              <w:u w:val="none"/>
+            </w:rPr>
+          </w:pPr>
+          <w:hyperlink w:anchor="_nzow8qsh88kv">
+            <w:r>
+              <w:rPr>
+                <w:rFonts w:ascii="Arial" w:cs="Arial" w:eastAsia="Arial" w:hAnsi="Arial"/>
+                <w:b w:val="0"/>
+                <w:bCs w:val="0"/>
+                <w:i w:val="0"/>
+                <w:iCs w:val="0"/>
+                <w:smallCaps w:val="0"/>
+                <w:strike w:val="0"/>
+                <w:color w:val="000000"/>
+                <w:sz w:val="28"/>
+                <w:szCs w:val="28"/>
+                <w:u w:val="none"/>
+                <w:shd w:fill="auto" w:val="clear"/>
+                <w:vertAlign w:val="baseline"/>
+                <w:rtl w:val="0"/>
+              </w:rPr>
+              <w:t xml:space="preserve">Instalar Ferramenta</w:t>
+              <w:tab/>
+              <w:t xml:space="preserve">6</w:t>
+            </w:r>
+          </w:hyperlink>
+          <w:r>
+            <w:rPr>
+              <w:rtl w:val="0"/>
+            </w:rPr>
+          </w:r>
+          <w:r>
+            <w:fldChar w:fldCharType="end"/>
+          </w:r>
+        </w:p>
+      </w:sdtContent>
+    </w:sdt>
     <w:p>
       <w:pPr>
         <w:pStyle w:val="Heading1"/>
         <w:rPr/>
       </w:pPr>
-      <w:bookmarkStart w:colFirst="0" w:colLast="0" w:name="_lswrd8r1f676" w:id="3"/>
+      <w:bookmarkStart w:colFirst="0" w:colLast="0" w:name="_qqlbrl6vedyp" w:id="3"/>
       <w:bookmarkEnd w:id="3"/>
       <w:r>
         <w:rPr>
           <w:rtl w:val="0"/>
         </w:rPr>
+      </w:r>
+    </w:p>
+    <w:p>
+      <w:pPr>
+        <w:pStyle w:val="Heading1"/>
+        <w:rPr/>
+      </w:pPr>
+      <w:bookmarkStart w:colFirst="0" w:colLast="0" w:name="_9zy0rhsuawyr" w:id="4"/>
+      <w:bookmarkEnd w:id="4"/>
+      <w:r>
+        <w:br w:type="page"/>
+      </w:r>
+      <w:r>
+        <w:rPr>
+          <w:rtl w:val="0"/>
+        </w:rPr>
+      </w:r>
+    </w:p>
+    <w:p>
+      <w:pPr>
+        <w:pStyle w:val="Heading1"/>
+        <w:rPr/>
+      </w:pPr>
+      <w:bookmarkStart w:colFirst="0" w:colLast="0" w:name="_lswrd8r1f676" w:id="5"/>
+      <w:bookmarkEnd w:id="5"/>
+      <w:r>
+        <w:rPr>
+          <w:rtl w:val="0"/>
+        </w:rPr>
         <w:t xml:space="preserve">Instalação</w:t>
       </w:r>
     </w:p>
@@ -254,8 +1187,8 @@
         <w:pStyle w:val="Heading2"/>
         <w:rPr/>
       </w:pPr>
-      <w:bookmarkStart w:colFirst="0" w:colLast="0" w:name="_ogkg0i61d2vr" w:id="4"/>
-      <w:bookmarkEnd w:id="4"/>
+      <w:bookmarkStart w:colFirst="0" w:colLast="0" w:name="_ogkg0i61d2vr" w:id="6"/>
+      <w:bookmarkEnd w:id="6"/>
       <w:r>
         <w:rPr>
           <w:rtl w:val="0"/>
@@ -284,8 +1217,8 @@
         <w:pStyle w:val="Heading2"/>
         <w:rPr/>
       </w:pPr>
-      <w:bookmarkStart w:colFirst="0" w:colLast="0" w:name="_i4ymig78zhck" w:id="5"/>
-      <w:bookmarkEnd w:id="5"/>
+      <w:bookmarkStart w:colFirst="0" w:colLast="0" w:name="_i4ymig78zhck" w:id="7"/>
+      <w:bookmarkEnd w:id="7"/>
       <w:r>
         <w:rPr>
           <w:rtl w:val="0"/>
@@ -316,8 +1249,8 @@
         <w:pStyle w:val="Heading2"/>
         <w:rPr/>
       </w:pPr>
-      <w:bookmarkStart w:colFirst="0" w:colLast="0" w:name="_pu2jo969e7v7" w:id="6"/>
-      <w:bookmarkEnd w:id="6"/>
+      <w:bookmarkStart w:colFirst="0" w:colLast="0" w:name="_pu2jo969e7v7" w:id="8"/>
+      <w:bookmarkEnd w:id="8"/>
       <w:r>
         <w:rPr>
           <w:rtl w:val="0"/>
@@ -346,8 +1279,8 @@
         <w:pStyle w:val="Heading2"/>
         <w:rPr/>
       </w:pPr>
-      <w:bookmarkStart w:colFirst="0" w:colLast="0" w:name="_feg8odw5wi2" w:id="7"/>
-      <w:bookmarkEnd w:id="7"/>
+      <w:bookmarkStart w:colFirst="0" w:colLast="0" w:name="_feg8odw5wi2" w:id="9"/>
+      <w:bookmarkEnd w:id="9"/>
       <w:r>
         <w:rPr>
           <w:rtl w:val="0"/>
@@ -376,8 +1309,8 @@
         <w:pStyle w:val="Heading2"/>
         <w:rPr/>
       </w:pPr>
-      <w:bookmarkStart w:colFirst="0" w:colLast="0" w:name="_tfs66oskrpgx" w:id="8"/>
-      <w:bookmarkEnd w:id="8"/>
+      <w:bookmarkStart w:colFirst="0" w:colLast="0" w:name="_tfs66oskrpgx" w:id="10"/>
+      <w:bookmarkEnd w:id="10"/>
       <w:r>
         <w:rPr>
           <w:rtl w:val="0"/>
@@ -406,8 +1339,8 @@
         <w:pStyle w:val="Heading2"/>
         <w:rPr/>
       </w:pPr>
-      <w:bookmarkStart w:colFirst="0" w:colLast="0" w:name="_4rb4ilw5cipe" w:id="9"/>
-      <w:bookmarkEnd w:id="9"/>
+      <w:bookmarkStart w:colFirst="0" w:colLast="0" w:name="_4rb4ilw5cipe" w:id="11"/>
+      <w:bookmarkEnd w:id="11"/>
       <w:r>
         <w:rPr>
           <w:rtl w:val="0"/>
@@ -480,8 +1413,8 @@
         <w:pStyle w:val="Heading1"/>
         <w:rPr/>
       </w:pPr>
-      <w:bookmarkStart w:colFirst="0" w:colLast="0" w:name="_x0fwppfpj4fv" w:id="10"/>
-      <w:bookmarkEnd w:id="10"/>
+      <w:bookmarkStart w:colFirst="0" w:colLast="0" w:name="_x0fwppfpj4fv" w:id="12"/>
+      <w:bookmarkEnd w:id="12"/>
       <w:r>
         <w:rPr>
           <w:rtl w:val="0"/>
@@ -505,8 +1438,8 @@
         <w:pStyle w:val="Heading2"/>
         <w:rPr/>
       </w:pPr>
-      <w:bookmarkStart w:colFirst="0" w:colLast="0" w:name="_l93um6h51vfo" w:id="11"/>
-      <w:bookmarkEnd w:id="11"/>
+      <w:bookmarkStart w:colFirst="0" w:colLast="0" w:name="_l93um6h51vfo" w:id="13"/>
+      <w:bookmarkEnd w:id="13"/>
       <w:r>
         <w:rPr>
           <w:rtl w:val="0"/>
@@ -546,8 +1479,8 @@
         <w:pStyle w:val="Heading3"/>
         <w:rPr/>
       </w:pPr>
-      <w:bookmarkStart w:colFirst="0" w:colLast="0" w:name="_tq31s8rtai0f" w:id="12"/>
-      <w:bookmarkEnd w:id="12"/>
+      <w:bookmarkStart w:colFirst="0" w:colLast="0" w:name="_tq31s8rtai0f" w:id="14"/>
+      <w:bookmarkEnd w:id="14"/>
       <w:r>
         <w:rPr>
           <w:rtl w:val="0"/>
@@ -656,8 +1589,8 @@
         <w:pStyle w:val="Heading2"/>
         <w:rPr/>
       </w:pPr>
-      <w:bookmarkStart w:colFirst="0" w:colLast="0" w:name="_s2qfkvbq3r0x" w:id="13"/>
-      <w:bookmarkEnd w:id="13"/>
+      <w:bookmarkStart w:colFirst="0" w:colLast="0" w:name="_s2qfkvbq3r0x" w:id="15"/>
+      <w:bookmarkEnd w:id="15"/>
       <w:r>
         <w:rPr>
           <w:rtl w:val="0"/>
@@ -755,8 +1688,8 @@
         <w:pStyle w:val="Heading2"/>
         <w:rPr/>
       </w:pPr>
-      <w:bookmarkStart w:colFirst="0" w:colLast="0" w:name="_3ujamar0g71u" w:id="14"/>
-      <w:bookmarkEnd w:id="14"/>
+      <w:bookmarkStart w:colFirst="0" w:colLast="0" w:name="_3ujamar0g71u" w:id="16"/>
+      <w:bookmarkEnd w:id="16"/>
       <w:r>
         <w:rPr>
           <w:rtl w:val="0"/>
@@ -843,8 +1776,8 @@
         <w:pStyle w:val="Heading2"/>
         <w:rPr/>
       </w:pPr>
-      <w:bookmarkStart w:colFirst="0" w:colLast="0" w:name="_lhc9he6sblom" w:id="15"/>
-      <w:bookmarkEnd w:id="15"/>
+      <w:bookmarkStart w:colFirst="0" w:colLast="0" w:name="_lhc9he6sblom" w:id="17"/>
+      <w:bookmarkEnd w:id="17"/>
       <w:r>
         <w:rPr>
           <w:rtl w:val="0"/>
@@ -924,8 +1857,8 @@
         <w:pStyle w:val="Heading2"/>
         <w:rPr/>
       </w:pPr>
-      <w:bookmarkStart w:colFirst="0" w:colLast="0" w:name="_tobhl41nhx6y" w:id="16"/>
-      <w:bookmarkEnd w:id="16"/>
+      <w:bookmarkStart w:colFirst="0" w:colLast="0" w:name="_tobhl41nhx6y" w:id="18"/>
+      <w:bookmarkEnd w:id="18"/>
       <w:r>
         <w:rPr>
           <w:rtl w:val="0"/>
@@ -985,8 +1918,8 @@
         <w:pStyle w:val="Heading2"/>
         <w:rPr/>
       </w:pPr>
-      <w:bookmarkStart w:colFirst="0" w:colLast="0" w:name="_hiao7qbh32d5" w:id="17"/>
-      <w:bookmarkEnd w:id="17"/>
+      <w:bookmarkStart w:colFirst="0" w:colLast="0" w:name="_hiao7qbh32d5" w:id="19"/>
+      <w:bookmarkEnd w:id="19"/>
       <w:r>
         <w:rPr>
           <w:rtl w:val="0"/>
@@ -1049,8 +1982,8 @@
         <w:pStyle w:val="Heading2"/>
         <w:rPr/>
       </w:pPr>
-      <w:bookmarkStart w:colFirst="0" w:colLast="0" w:name="_2qedi93oac2m" w:id="18"/>
-      <w:bookmarkEnd w:id="18"/>
+      <w:bookmarkStart w:colFirst="0" w:colLast="0" w:name="_2qedi93oac2m" w:id="20"/>
+      <w:bookmarkEnd w:id="20"/>
       <w:r>
         <w:rPr>
           <w:rtl w:val="0"/>
@@ -1110,8 +2043,8 @@
         <w:pStyle w:val="Heading2"/>
         <w:rPr/>
       </w:pPr>
-      <w:bookmarkStart w:colFirst="0" w:colLast="0" w:name="_i26w3zadl3fm" w:id="19"/>
-      <w:bookmarkEnd w:id="19"/>
+      <w:bookmarkStart w:colFirst="0" w:colLast="0" w:name="_i26w3zadl3fm" w:id="21"/>
+      <w:bookmarkEnd w:id="21"/>
       <w:r>
         <w:rPr>
           <w:rtl w:val="0"/>
@@ -1164,8 +2097,8 @@
         <w:pStyle w:val="Heading1"/>
         <w:rPr/>
       </w:pPr>
-      <w:bookmarkStart w:colFirst="0" w:colLast="0" w:name="_4tn05rz177xf" w:id="20"/>
-      <w:bookmarkEnd w:id="20"/>
+      <w:bookmarkStart w:colFirst="0" w:colLast="0" w:name="_4tn05rz177xf" w:id="22"/>
+      <w:bookmarkEnd w:id="22"/>
       <w:r>
         <w:rPr>
           <w:rtl w:val="0"/>
@@ -1178,8 +2111,8 @@
         <w:pStyle w:val="Heading2"/>
         <w:rPr/>
       </w:pPr>
-      <w:bookmarkStart w:colFirst="0" w:colLast="0" w:name="_abbgg543k0dv" w:id="21"/>
-      <w:bookmarkEnd w:id="21"/>
+      <w:bookmarkStart w:colFirst="0" w:colLast="0" w:name="_abbgg543k0dv" w:id="23"/>
+      <w:bookmarkEnd w:id="23"/>
       <w:r>
         <w:rPr>
           <w:rtl w:val="0"/>
@@ -1208,8 +2141,8 @@
         <w:pStyle w:val="Heading2"/>
         <w:rPr/>
       </w:pPr>
-      <w:bookmarkStart w:colFirst="0" w:colLast="0" w:name="_cygb6dp5gz0l" w:id="22"/>
-      <w:bookmarkEnd w:id="22"/>
+      <w:bookmarkStart w:colFirst="0" w:colLast="0" w:name="_cygb6dp5gz0l" w:id="24"/>
+      <w:bookmarkEnd w:id="24"/>
       <w:r>
         <w:rPr>
           <w:rtl w:val="0"/>
@@ -1238,8 +2171,8 @@
         <w:pStyle w:val="Heading2"/>
         <w:rPr/>
       </w:pPr>
-      <w:bookmarkStart w:colFirst="0" w:colLast="0" w:name="_nzow8qsh88kv" w:id="23"/>
-      <w:bookmarkEnd w:id="23"/>
+      <w:bookmarkStart w:colFirst="0" w:colLast="0" w:name="_nzow8qsh88kv" w:id="25"/>
+      <w:bookmarkEnd w:id="25"/>
       <w:r>
         <w:rPr>
           <w:rtl w:val="0"/>
@@ -1391,12 +2324,69 @@
       </w:r>
     </w:p>
     <w:sectPr>
+      <w:headerReference r:id="rId8" w:type="first"/>
+      <w:footerReference r:id="rId9" w:type="default"/>
+      <w:footerReference r:id="rId10" w:type="first"/>
       <w:pgSz w:h="16834" w:w="11909" w:orient="portrait"/>
       <w:pgMar w:bottom="1440" w:top="1440" w:left="1440" w:right="1440" w:header="720" w:footer="720"/>
       <w:pgNumType w:start="1"/>
+      <w:titlePg w:val="1"/>
     </w:sectPr>
   </w:body>
 </w:document>
+</file>
+
+<file path=word/footer1.xml><?xml version="1.0" encoding="utf-8"?>
+<w:ftr xmlns:mc="http://schemas.openxmlformats.org/markup-compatibility/2006" xmlns:o="urn:schemas-microsoft-com:office:office" xmlns:r="http://schemas.openxmlformats.org/officeDocument/2006/relationships" xmlns:m="http://schemas.openxmlformats.org/officeDocument/2006/math" xmlns:v="urn:schemas-microsoft-com:vml" xmlns:wp="http://schemas.openxmlformats.org/drawingml/2006/wordprocessingDrawing" xmlns:w10="urn:schemas-microsoft-com:office:word" xmlns:w="http://schemas.openxmlformats.org/wordprocessingml/2006/main" xmlns:wne="http://schemas.microsoft.com/office/word/2006/wordml" xmlns:sl="http://schemas.openxmlformats.org/schemaLibrary/2006/main" xmlns:a="http://schemas.openxmlformats.org/drawingml/2006/main" xmlns:pic="http://schemas.openxmlformats.org/drawingml/2006/picture" xmlns:c="http://schemas.openxmlformats.org/drawingml/2006/chart" xmlns:lc="http://schemas.openxmlformats.org/drawingml/2006/lockedCanvas" xmlns:dgm="http://schemas.openxmlformats.org/drawingml/2006/diagram" xmlns:wps="http://schemas.microsoft.com/office/word/2010/wordprocessingShape" xmlns:wpg="http://schemas.microsoft.com/office/word/2010/wordprocessingGroup" xmlns:w14="http://schemas.microsoft.com/office/word/2010/wordml" xmlns:w15="http://schemas.microsoft.com/office/word/2012/wordml" xmlns:w16="http://schemas.microsoft.com/office/word/2018/wordml" xmlns:w16cex="http://schemas.microsoft.com/office/word/2018/wordml/cex" xmlns:w16cid="http://schemas.microsoft.com/office/word/2016/wordml/cid" xmlns="http://schemas.microsoft.com/office/tasks/2019/documenttasks" xmlns:cr="http://schemas.microsoft.com/office/comments/2020/reactions">
+  <w:p>
+    <w:pPr>
+      <w:jc w:val="right"/>
+      <w:rPr/>
+    </w:pPr>
+    <w:r>
+      <w:rPr/>
+      <w:fldChar w:fldCharType="begin"/>
+      <w:instrText xml:space="preserve">PAGE</w:instrText>
+      <w:fldChar w:fldCharType="separate"/>
+      <w:fldChar w:fldCharType="end"/>
+    </w:r>
+    <w:r>
+      <w:rPr>
+        <w:rtl w:val="0"/>
+      </w:rPr>
+    </w:r>
+  </w:p>
+</w:ftr>
+</file>
+
+<file path=word/footer2.xml><?xml version="1.0" encoding="utf-8"?>
+<w:ftr xmlns:mc="http://schemas.openxmlformats.org/markup-compatibility/2006" xmlns:o="urn:schemas-microsoft-com:office:office" xmlns:r="http://schemas.openxmlformats.org/officeDocument/2006/relationships" xmlns:m="http://schemas.openxmlformats.org/officeDocument/2006/math" xmlns:v="urn:schemas-microsoft-com:vml" xmlns:wp="http://schemas.openxmlformats.org/drawingml/2006/wordprocessingDrawing" xmlns:w10="urn:schemas-microsoft-com:office:word" xmlns:w="http://schemas.openxmlformats.org/wordprocessingml/2006/main" xmlns:wne="http://schemas.microsoft.com/office/word/2006/wordml" xmlns:sl="http://schemas.openxmlformats.org/schemaLibrary/2006/main" xmlns:a="http://schemas.openxmlformats.org/drawingml/2006/main" xmlns:pic="http://schemas.openxmlformats.org/drawingml/2006/picture" xmlns:c="http://schemas.openxmlformats.org/drawingml/2006/chart" xmlns:lc="http://schemas.openxmlformats.org/drawingml/2006/lockedCanvas" xmlns:dgm="http://schemas.openxmlformats.org/drawingml/2006/diagram" xmlns:wps="http://schemas.microsoft.com/office/word/2010/wordprocessingShape" xmlns:wpg="http://schemas.microsoft.com/office/word/2010/wordprocessingGroup" xmlns:w14="http://schemas.microsoft.com/office/word/2010/wordml" xmlns:w15="http://schemas.microsoft.com/office/word/2012/wordml" xmlns:w16="http://schemas.microsoft.com/office/word/2018/wordml" xmlns:w16cex="http://schemas.microsoft.com/office/word/2018/wordml/cex" xmlns:w16cid="http://schemas.microsoft.com/office/word/2016/wordml/cid" xmlns="http://schemas.microsoft.com/office/tasks/2019/documenttasks" xmlns:cr="http://schemas.microsoft.com/office/comments/2020/reactions">
+  <w:p>
+    <w:pPr>
+      <w:rPr/>
+    </w:pPr>
+    <w:r>
+      <w:rPr>
+        <w:rtl w:val="0"/>
+      </w:rPr>
+    </w:r>
+  </w:p>
+</w:ftr>
+</file>
+
+<file path=word/header1.xml><?xml version="1.0" encoding="utf-8"?>
+<w:hdr xmlns:mc="http://schemas.openxmlformats.org/markup-compatibility/2006" xmlns:o="urn:schemas-microsoft-com:office:office" xmlns:r="http://schemas.openxmlformats.org/officeDocument/2006/relationships" xmlns:m="http://schemas.openxmlformats.org/officeDocument/2006/math" xmlns:v="urn:schemas-microsoft-com:vml" xmlns:wp="http://schemas.openxmlformats.org/drawingml/2006/wordprocessingDrawing" xmlns:w10="urn:schemas-microsoft-com:office:word" xmlns:w="http://schemas.openxmlformats.org/wordprocessingml/2006/main" xmlns:wne="http://schemas.microsoft.com/office/word/2006/wordml" xmlns:sl="http://schemas.openxmlformats.org/schemaLibrary/2006/main" xmlns:a="http://schemas.openxmlformats.org/drawingml/2006/main" xmlns:pic="http://schemas.openxmlformats.org/drawingml/2006/picture" xmlns:c="http://schemas.openxmlformats.org/drawingml/2006/chart" xmlns:lc="http://schemas.openxmlformats.org/drawingml/2006/lockedCanvas" xmlns:dgm="http://schemas.openxmlformats.org/drawingml/2006/diagram" xmlns:wps="http://schemas.microsoft.com/office/word/2010/wordprocessingShape" xmlns:wpg="http://schemas.microsoft.com/office/word/2010/wordprocessingGroup" xmlns:w14="http://schemas.microsoft.com/office/word/2010/wordml" xmlns:w15="http://schemas.microsoft.com/office/word/2012/wordml" xmlns:w16="http://schemas.microsoft.com/office/word/2018/wordml" xmlns:w16cex="http://schemas.microsoft.com/office/word/2018/wordml/cex" xmlns:w16cid="http://schemas.microsoft.com/office/word/2016/wordml/cid" xmlns="http://schemas.microsoft.com/office/tasks/2019/documenttasks" xmlns:cr="http://schemas.microsoft.com/office/comments/2020/reactions">
+  <w:p>
+    <w:pPr>
+      <w:rPr/>
+    </w:pPr>
+    <w:r>
+      <w:rPr>
+        <w:rtl w:val="0"/>
+      </w:rPr>
+    </w:r>
+  </w:p>
+</w:hdr>
 </file>
 
 <file path=word/numbering.xml><?xml version="1.0" encoding="utf-8"?>

</xml_diff>